<commit_message>
update word pert 7
</commit_message>
<xml_diff>
--- a/Tugas_Teori/Pertemuan7/TUGAS LATIHAN SOAL PERTEMUAN 7.docx
+++ b/Tugas_Teori/Pertemuan7/TUGAS LATIHAN SOAL PERTEMUAN 7.docx
@@ -715,6 +715,77 @@
       </w:pPr>
       <w:r>
         <w:rPr>
+          <w:b/>
+          <w:bCs/>
+          <w:sz w:val="24"/>
+          <w:szCs w:val="24"/>
+        </w:rPr>
+        <w:drawing>
+          <wp:anchor distT="0" distB="0" distL="114300" distR="114300" simplePos="0" relativeHeight="251658240" behindDoc="0" locked="0" layoutInCell="1" allowOverlap="1" wp14:anchorId="07817969" wp14:editId="6A2487B2">
+            <wp:simplePos x="0" y="0"/>
+            <wp:positionH relativeFrom="column">
+              <wp:posOffset>209550</wp:posOffset>
+            </wp:positionH>
+            <wp:positionV relativeFrom="paragraph">
+              <wp:posOffset>4250690</wp:posOffset>
+            </wp:positionV>
+            <wp:extent cx="2971800" cy="4692015"/>
+            <wp:effectExtent l="0" t="0" r="0" b="0"/>
+            <wp:wrapNone/>
+            <wp:docPr id="1956413814" name="Picture 6"/>
+            <wp:cNvGraphicFramePr>
+              <a:graphicFrameLocks xmlns:a="http://schemas.openxmlformats.org/drawingml/2006/main" noChangeAspect="1"/>
+            </wp:cNvGraphicFramePr>
+            <a:graphic xmlns:a="http://schemas.openxmlformats.org/drawingml/2006/main">
+              <a:graphicData uri="http://schemas.openxmlformats.org/drawingml/2006/picture">
+                <pic:pic xmlns:pic="http://schemas.openxmlformats.org/drawingml/2006/picture">
+                  <pic:nvPicPr>
+                    <pic:cNvPr id="0" name="Picture 23"/>
+                    <pic:cNvPicPr>
+                      <a:picLocks noChangeAspect="1" noChangeArrowheads="1"/>
+                    </pic:cNvPicPr>
+                  </pic:nvPicPr>
+                  <pic:blipFill>
+                    <a:blip r:embed="rId4" cstate="print">
+                      <a:extLst>
+                        <a:ext uri="{28A0092B-C50C-407E-A947-70E740481C1C}">
+                          <a14:useLocalDpi xmlns:a14="http://schemas.microsoft.com/office/drawing/2010/main" val="0"/>
+                        </a:ext>
+                      </a:extLst>
+                    </a:blip>
+                    <a:srcRect/>
+                    <a:stretch>
+                      <a:fillRect/>
+                    </a:stretch>
+                  </pic:blipFill>
+                  <pic:spPr bwMode="auto">
+                    <a:xfrm>
+                      <a:off x="0" y="0"/>
+                      <a:ext cx="2971800" cy="4692015"/>
+                    </a:xfrm>
+                    <a:prstGeom prst="rect">
+                      <a:avLst/>
+                    </a:prstGeom>
+                    <a:noFill/>
+                    <a:ln>
+                      <a:noFill/>
+                    </a:ln>
+                  </pic:spPr>
+                </pic:pic>
+              </a:graphicData>
+            </a:graphic>
+            <wp14:sizeRelH relativeFrom="margin">
+              <wp14:pctWidth>0</wp14:pctWidth>
+            </wp14:sizeRelH>
+            <wp14:sizeRelV relativeFrom="margin">
+              <wp14:pctHeight>0</wp14:pctHeight>
+            </wp14:sizeRelV>
+          </wp:anchor>
+        </w:drawing>
+      </w:r>
+      <w:r>
+        <w:rPr>
+          <w:noProof/>
           <w:sz w:val="24"/>
           <w:szCs w:val="24"/>
         </w:rPr>
@@ -736,7 +807,7 @@
                     </pic:cNvPicPr>
                   </pic:nvPicPr>
                   <pic:blipFill>
-                    <a:blip r:embed="rId4" cstate="print">
+                    <a:blip r:embed="rId5" cstate="print">
                       <a:extLst>
                         <a:ext uri="{28A0092B-C50C-407E-A947-70E740481C1C}">
                           <a14:useLocalDpi xmlns:a14="http://schemas.microsoft.com/office/drawing/2010/main" val="0"/>
@@ -775,7 +846,7 @@
           <w:bCs/>
           <w:sz w:val="24"/>
           <w:szCs w:val="24"/>
-          <w:lang w:val="en-US"/>
+          <w:lang w:val="fi-FI"/>
         </w:rPr>
       </w:pPr>
       <w:r>
@@ -784,77 +855,7 @@
           <w:bCs/>
           <w:sz w:val="24"/>
           <w:szCs w:val="24"/>
-        </w:rPr>
-        <w:drawing>
-          <wp:anchor distT="0" distB="0" distL="114300" distR="114300" simplePos="0" relativeHeight="251659264" behindDoc="0" locked="0" layoutInCell="1" allowOverlap="1" wp14:anchorId="0FE3C48A" wp14:editId="451156E3">
-            <wp:simplePos x="0" y="0"/>
-            <wp:positionH relativeFrom="column">
-              <wp:posOffset>828675</wp:posOffset>
-            </wp:positionH>
-            <wp:positionV relativeFrom="paragraph">
-              <wp:posOffset>210185</wp:posOffset>
-            </wp:positionV>
-            <wp:extent cx="3073294" cy="4114800"/>
-            <wp:effectExtent l="0" t="0" r="0" b="0"/>
-            <wp:wrapNone/>
-            <wp:docPr id="560778247" name="Picture 6"/>
-            <wp:cNvGraphicFramePr>
-              <a:graphicFrameLocks xmlns:a="http://schemas.openxmlformats.org/drawingml/2006/main" noChangeAspect="1"/>
-            </wp:cNvGraphicFramePr>
-            <a:graphic xmlns:a="http://schemas.openxmlformats.org/drawingml/2006/main">
-              <a:graphicData uri="http://schemas.openxmlformats.org/drawingml/2006/picture">
-                <pic:pic xmlns:pic="http://schemas.openxmlformats.org/drawingml/2006/picture">
-                  <pic:nvPicPr>
-                    <pic:cNvPr id="0" name="Picture 20"/>
-                    <pic:cNvPicPr>
-                      <a:picLocks noChangeAspect="1" noChangeArrowheads="1"/>
-                    </pic:cNvPicPr>
-                  </pic:nvPicPr>
-                  <pic:blipFill>
-                    <a:blip r:embed="rId5" cstate="print">
-                      <a:extLst>
-                        <a:ext uri="{28A0092B-C50C-407E-A947-70E740481C1C}">
-                          <a14:useLocalDpi xmlns:a14="http://schemas.microsoft.com/office/drawing/2010/main" val="0"/>
-                        </a:ext>
-                      </a:extLst>
-                    </a:blip>
-                    <a:srcRect/>
-                    <a:stretch>
-                      <a:fillRect/>
-                    </a:stretch>
-                  </pic:blipFill>
-                  <pic:spPr bwMode="auto">
-                    <a:xfrm>
-                      <a:off x="0" y="0"/>
-                      <a:ext cx="3073294" cy="4114800"/>
-                    </a:xfrm>
-                    <a:prstGeom prst="rect">
-                      <a:avLst/>
-                    </a:prstGeom>
-                    <a:noFill/>
-                    <a:ln>
-                      <a:noFill/>
-                    </a:ln>
-                  </pic:spPr>
-                </pic:pic>
-              </a:graphicData>
-            </a:graphic>
-            <wp14:sizeRelH relativeFrom="margin">
-              <wp14:pctWidth>0</wp14:pctWidth>
-            </wp14:sizeRelH>
-            <wp14:sizeRelV relativeFrom="margin">
-              <wp14:pctHeight>0</wp14:pctHeight>
-            </wp14:sizeRelV>
-          </wp:anchor>
-        </w:drawing>
-      </w:r>
-      <w:r>
-        <w:rPr>
-          <w:b/>
-          <w:bCs/>
-          <w:sz w:val="24"/>
-          <w:szCs w:val="24"/>
-          <w:lang w:val="en-US"/>
+          <w:lang w:val="fi-FI"/>
         </w:rPr>
         <w:t>Soal 3</w:t>
       </w:r>
@@ -866,53 +867,6 @@
           <w:bCs/>
           <w:sz w:val="24"/>
           <w:szCs w:val="24"/>
-          <w:lang w:val="en-US"/>
-        </w:rPr>
-      </w:pPr>
-      <w:proofErr w:type="spellStart"/>
-      <w:r>
-        <w:rPr>
-          <w:sz w:val="24"/>
-          <w:szCs w:val="24"/>
-          <w:lang w:val="en-US"/>
-        </w:rPr>
-        <w:t>satu</w:t>
-      </w:r>
-      <w:proofErr w:type="spellEnd"/>
-      <w:r>
-        <w:rPr>
-          <w:sz w:val="24"/>
-          <w:szCs w:val="24"/>
-          <w:lang w:val="en-US"/>
-        </w:rPr>
-        <w:t xml:space="preserve"> </w:t>
-      </w:r>
-      <w:proofErr w:type="spellStart"/>
-      <w:r>
-        <w:rPr>
-          <w:sz w:val="24"/>
-          <w:szCs w:val="24"/>
-          <w:lang w:val="en-US"/>
-        </w:rPr>
-        <w:t>percobaan</w:t>
-      </w:r>
-      <w:proofErr w:type="spellEnd"/>
-      <w:r>
-        <w:rPr>
-          <w:sz w:val="24"/>
-          <w:szCs w:val="24"/>
-          <w:lang w:val="en-US"/>
-        </w:rPr>
-        <w:t xml:space="preserve"> login</w:t>
-      </w:r>
-    </w:p>
-    <w:p>
-      <w:pPr>
-        <w:rPr>
-          <w:b/>
-          <w:bCs/>
-          <w:sz w:val="24"/>
-          <w:szCs w:val="24"/>
         </w:rPr>
       </w:pPr>
     </w:p>
@@ -933,153 +887,31 @@
           <w:bCs/>
           <w:sz w:val="24"/>
           <w:szCs w:val="24"/>
-          <w:lang w:val="en-US"/>
+          <w:lang w:val="fi-FI"/>
         </w:rPr>
       </w:pPr>
-      <w:r>
-        <w:rPr>
-          <w:b/>
-          <w:bCs/>
-          <w:sz w:val="24"/>
-          <w:szCs w:val="24"/>
-          <w:lang w:val="en-US"/>
-        </w:rPr>
-        <w:br w:type="page"/>
-      </w:r>
     </w:p>
     <w:p>
       <w:pPr>
         <w:rPr>
-          <w:sz w:val="24"/>
-          <w:szCs w:val="24"/>
-          <w:lang w:val="en-US"/>
-        </w:rPr>
-      </w:pPr>
-      <w:r>
-        <w:rPr>
           <w:b/>
           <w:bCs/>
           <w:sz w:val="24"/>
           <w:szCs w:val="24"/>
-        </w:rPr>
-        <w:lastRenderedPageBreak/>
-        <w:drawing>
-          <wp:anchor distT="0" distB="0" distL="114300" distR="114300" simplePos="0" relativeHeight="251658240" behindDoc="0" locked="0" layoutInCell="1" allowOverlap="1" wp14:anchorId="2F00807E" wp14:editId="07D9AEBE">
-            <wp:simplePos x="0" y="0"/>
-            <wp:positionH relativeFrom="column">
-              <wp:posOffset>-133350</wp:posOffset>
-            </wp:positionH>
-            <wp:positionV relativeFrom="paragraph">
-              <wp:posOffset>580390</wp:posOffset>
-            </wp:positionV>
-            <wp:extent cx="3952875" cy="4885349"/>
-            <wp:effectExtent l="0" t="0" r="0" b="0"/>
-            <wp:wrapNone/>
-            <wp:docPr id="676269647" name="Picture 4"/>
-            <wp:cNvGraphicFramePr>
-              <a:graphicFrameLocks xmlns:a="http://schemas.openxmlformats.org/drawingml/2006/main" noChangeAspect="1"/>
-            </wp:cNvGraphicFramePr>
-            <a:graphic xmlns:a="http://schemas.openxmlformats.org/drawingml/2006/main">
-              <a:graphicData uri="http://schemas.openxmlformats.org/drawingml/2006/picture">
-                <pic:pic xmlns:pic="http://schemas.openxmlformats.org/drawingml/2006/picture">
-                  <pic:nvPicPr>
-                    <pic:cNvPr id="0" name="Picture 13"/>
-                    <pic:cNvPicPr>
-                      <a:picLocks noChangeAspect="1" noChangeArrowheads="1"/>
-                    </pic:cNvPicPr>
-                  </pic:nvPicPr>
-                  <pic:blipFill>
-                    <a:blip r:embed="rId6" cstate="print">
-                      <a:extLst>
-                        <a:ext uri="{28A0092B-C50C-407E-A947-70E740481C1C}">
-                          <a14:useLocalDpi xmlns:a14="http://schemas.microsoft.com/office/drawing/2010/main" val="0"/>
-                        </a:ext>
-                      </a:extLst>
-                    </a:blip>
-                    <a:srcRect/>
-                    <a:stretch>
-                      <a:fillRect/>
-                    </a:stretch>
-                  </pic:blipFill>
-                  <pic:spPr bwMode="auto">
-                    <a:xfrm>
-                      <a:off x="0" y="0"/>
-                      <a:ext cx="3952875" cy="4885349"/>
-                    </a:xfrm>
-                    <a:prstGeom prst="rect">
-                      <a:avLst/>
-                    </a:prstGeom>
-                    <a:noFill/>
-                    <a:ln>
-                      <a:noFill/>
-                    </a:ln>
-                  </pic:spPr>
-                </pic:pic>
-              </a:graphicData>
-            </a:graphic>
-            <wp14:sizeRelH relativeFrom="margin">
-              <wp14:pctWidth>0</wp14:pctWidth>
-            </wp14:sizeRelH>
-            <wp14:sizeRelV relativeFrom="margin">
-              <wp14:pctHeight>0</wp14:pctHeight>
-            </wp14:sizeRelV>
-          </wp:anchor>
-        </w:drawing>
-      </w:r>
-      <w:proofErr w:type="spellStart"/>
-      <w:r>
-        <w:rPr>
-          <w:sz w:val="24"/>
-          <w:szCs w:val="24"/>
-          <w:lang w:val="en-US"/>
-        </w:rPr>
-        <w:t>Percobaan</w:t>
-      </w:r>
-      <w:proofErr w:type="spellEnd"/>
-      <w:r>
-        <w:rPr>
-          <w:sz w:val="24"/>
-          <w:szCs w:val="24"/>
-          <w:lang w:val="en-US"/>
-        </w:rPr>
-        <w:t xml:space="preserve"> login </w:t>
-      </w:r>
-      <w:proofErr w:type="spellStart"/>
-      <w:r>
-        <w:rPr>
-          <w:sz w:val="24"/>
-          <w:szCs w:val="24"/>
-          <w:lang w:val="en-US"/>
-        </w:rPr>
-        <w:t>berulang</w:t>
-      </w:r>
-      <w:proofErr w:type="spellEnd"/>
-      <w:r>
-        <w:rPr>
-          <w:sz w:val="24"/>
-          <w:szCs w:val="24"/>
-          <w:lang w:val="en-US"/>
-        </w:rPr>
-        <w:t xml:space="preserve"> </w:t>
-      </w:r>
-      <w:proofErr w:type="spellStart"/>
-      <w:r>
-        <w:rPr>
-          <w:sz w:val="24"/>
-          <w:szCs w:val="24"/>
-          <w:lang w:val="en-US"/>
-        </w:rPr>
-        <w:t>jika</w:t>
-      </w:r>
-      <w:proofErr w:type="spellEnd"/>
-      <w:r>
-        <w:rPr>
-          <w:sz w:val="24"/>
-          <w:szCs w:val="24"/>
-          <w:lang w:val="en-US"/>
-        </w:rPr>
-        <w:t xml:space="preserve"> salah</w:t>
-      </w:r>
+          <w:lang w:val="fi-FI"/>
+        </w:rPr>
+      </w:pPr>
+    </w:p>
+    <w:p>
+      <w:pPr>
+        <w:rPr>
+          <w:b/>
+          <w:bCs/>
+          <w:sz w:val="24"/>
+          <w:szCs w:val="24"/>
+          <w:lang w:val="fi-FI"/>
+        </w:rPr>
+      </w:pPr>
     </w:p>
     <w:sectPr>
       <w:pgSz w:w="11906" w:h="16838"/>

</xml_diff>